<commit_message>
Simplify hydrogen hypothesis paragraph
Co-Authored-By: Claude Opus 5.5 <noreply@anthropic.com>
Claude-Session: https://claude.ai/code/session_016jwkroY9UTNnZbz9w3bpCR
</commit_message>
<xml_diff>
--- a/lab/QM_Lab_Report.docx
+++ b/lab/QM_Lab_Report.docx
@@ -298,7 +298,7 @@
         <w:pStyle w:val="BodyText"/>
       </w:pPr>
       <w:r>
-        <w:t xml:space="preserve">An incandescent bulb gives off light because its hot filament emits a continuous spectrum, with all visible colors and no gaps. Atoms of a gas in a discharge lamp were expected to behave differently. It was hypothesized that hydrogen gives a discrete line spectrum, because its electron can only exist at certain energy levels. When the electron drops from a higher level to a lower one, it releases a photon whose energy equals the gap between the levels. For visible lines, the electron ends at</w:t>
+        <w:t xml:space="preserve">A hot bulb filament gives off all colors of visible light with no gaps, which is called a continuous spectrum. It was hypothesized that hydrogen would not do this. Instead, it would give off only a few bright lines of color, which is called a discrete spectrum. This is because the electron in hydrogen can only have certain energies. When it drops from a higher level to a lower one, it gives off light with energy equal to the difference between the two levels. For visible light, the electron always drops to</w:t>
       </w:r>
       <w:r>
         <w:t xml:space="preserve"> </w:t>
@@ -314,7 +314,7 @@
         <w:t xml:space="preserve"> </w:t>
       </w:r>
       <w:r>
-        <w:t xml:space="preserve">= 2. The expected wavelengths follow the equation below, where</w:t>
+        <w:t xml:space="preserve">= 2. The expected wavelengths come from the equation below, where</w:t>
       </w:r>
       <w:r>
         <w:t xml:space="preserve"> </w:t>
@@ -386,7 +386,7 @@
         <w:t xml:space="preserve"> </w:t>
       </w:r>
       <w:r>
-        <w:t xml:space="preserve">= 3, 4, 5, and 6. This predicts four visible lines near 656, 486, 434, and 410 nm.</w:t>
+        <w:t xml:space="preserve">= 3, 4, 5, or 6. This predicts four lines at about 656, 486, 434, and 410 nm.</w:t>
       </w:r>
     </w:p>
     <w:p>

</xml_diff>

<commit_message>
Reword hydrogen hypothesis paragraph in first person
Co-Authored-By: Claude Opus 5.5 <noreply@anthropic.com>
Claude-Session: https://claude.ai/code/session_016jwkroY9UTNnZbz9w3bpCR
</commit_message>
<xml_diff>
--- a/lab/QM_Lab_Report.docx
+++ b/lab/QM_Lab_Report.docx
@@ -298,7 +298,7 @@
         <w:pStyle w:val="BodyText"/>
       </w:pPr>
       <w:r>
-        <w:t xml:space="preserve">A hot bulb filament gives off all colors of visible light with no gaps, which is called a continuous spectrum. It was hypothesized that hydrogen would not do this. Instead, it would give off only a few bright lines of color, which is called a discrete spectrum. This is because the electron in hydrogen can only have certain energies. When it drops from a higher level to a lower one, it gives off light with energy equal to the difference between the two levels. For visible light, the electron always drops to</w:t>
+        <w:t xml:space="preserve">We expected the incandescent bulb to show a continuous spectrum, meaning every color with no gaps, since it’s just a hot filament. Hydrogen should be different. We predicted it would only show a few separate bright lines (a discrete spectrum) because its electron can only sit at certain energy levels. When the electron drops down a level, it gives off a photon with energy equal to the gap between those levels. All the visible lines come from drops to</w:t>
       </w:r>
       <w:r>
         <w:t xml:space="preserve"> </w:t>
@@ -314,7 +314,7 @@
         <w:t xml:space="preserve"> </w:t>
       </w:r>
       <w:r>
-        <w:t xml:space="preserve">= 2. The expected wavelengths come from the equation below, where</w:t>
+        <w:t xml:space="preserve">= 2, so we used the equation below with</w:t>
       </w:r>
       <w:r>
         <w:t xml:space="preserve"> </w:t>
@@ -386,7 +386,7 @@
         <w:t xml:space="preserve"> </w:t>
       </w:r>
       <w:r>
-        <w:t xml:space="preserve">= 3, 4, 5, or 6. This predicts four lines at about 656, 486, 434, and 410 nm.</w:t>
+        <w:t xml:space="preserve">= 3, 4, 5, and 6. Based on this, we expected to see four lines at about 656, 486, 434, and 410 nm.</w:t>
       </w:r>
     </w:p>
     <w:p>

</xml_diff>